<commit_message>
Update version to 1.0 and author to Feet in Focus
Changes across manifest.yml, plugin/__init__.py, install.py, build_rhi.py,
and generate_manual.py. Rebuilt .rhi installer as 3DShoemaker_1.0.rhi and
regenerated the user manual with updated version and author on cover page.

https://claude.ai/code/session_01WmKTfeGCbHjhaBjEwhSWte
</commit_message>
<xml_diff>
--- a/3DShoemaker_Rhino8_Python/3DShoemaker_Rhino8_User_Manual.docx
+++ b/3DShoemaker_Rhino8_Python/3DShoemaker_Rhino8_User_Manual.docx
@@ -43,7 +43,19 @@
           <w:color w:val="666666"/>
           <w:sz w:val="28"/>
         </w:rPr>
-        <w:t>Version 8.4.0.8</w:t>
+        <w:t>Version 1.0</w:t>
+      </w:r>
+    </w:p>
+    <w:p>
+      <w:pPr>
+        <w:jc w:val="center"/>
+      </w:pPr>
+      <w:r>
+        <w:rPr>
+          <w:color w:val="666666"/>
+          <w:sz w:val="28"/>
+        </w:rPr>
+        <w:t>by Feet in Focus</w:t>
       </w:r>
     </w:p>
     <w:p/>
@@ -3729,7 +3741,7 @@
           <w:color w:val="999999"/>
           <w:sz w:val="18"/>
         </w:rPr>
-        <w:t>3DShoemaker Plugin for Rhino 8 - User Manual v8.4.0.8</w:t>
+        <w:t>3DShoemaker Plugin for Rhino 8 - User Manual v1.0</w:t>
       </w:r>
       <w:r>
         <w:rPr>

</xml_diff>